<commit_message>
Refine interactive styling and add updated PDF and Word CVs
</commit_message>
<xml_diff>
--- a/public/Eduardo_Escamilla_CV.docx
+++ b/public/Eduardo_Escamilla_CV.docx
@@ -59,6 +59,28 @@
             <w:sz w:val="18"/>
           </w:rPr>
           <w:t>GitHub</w:t>
+        </w:r>
+      </w:hyperlink>
+    </w:p>
+    <w:p>
+      <w:pPr>
+        <w:spacing w:after="80"/>
+        <w:jc w:val="center"/>
+      </w:pPr>
+      <w:r>
+        <w:rPr>
+          <w:sz w:val="18"/>
+        </w:rPr>
+        <w:t xml:space="preserve">Portfolio: </w:t>
+      </w:r>
+      <w:hyperlink r:id="rId19">
+        <w:r>
+          <w:rPr>
+            <w:color w:val="0563C1"/>
+            <w:u w:val="single"/>
+            <w:sz w:val="18"/>
+          </w:rPr>
+          <w:t>eduardoeescamilla.com</w:t>
         </w:r>
       </w:hyperlink>
     </w:p>

</xml_diff>